<commit_message>
Başlık 2 ve 4 de güncellemeler
</commit_message>
<xml_diff>
--- a/PSD.docx
+++ b/PSD.docx
@@ -3,6 +3,9 @@
 <w:document xmlns:wpc="http://schemas.microsoft.com/office/word/2010/wordprocessingCanvas" xmlns:cx="http://schemas.microsoft.com/office/drawing/2014/chartex" xmlns:cx1="http://schemas.microsoft.com/office/drawing/2015/9/8/chartex" xmlns:cx2="http://schemas.microsoft.com/office/drawing/2015/10/21/chartex" xmlns:cx3="http://schemas.microsoft.com/office/drawing/2016/5/9/chartex" xmlns:cx4="http://schemas.microsoft.com/office/drawing/2016/5/10/chartex" xmlns:cx5="http://schemas.microsoft.com/office/drawing/2016/5/11/chartex" xmlns:cx6="http://schemas.microsoft.com/office/drawing/2016/5/12/chartex" xmlns:cx7="http://schemas.microsoft.com/office/drawing/2016/5/13/chartex" xmlns:cx8="http://schemas.microsoft.com/office/drawing/2016/5/14/chartex" xmlns:mc="http://schemas.openxmlformats.org/markup-compatibility/2006" xmlns:aink="http://schemas.microsoft.com/office/drawing/2016/ink" xmlns:am3d="http://schemas.microsoft.com/office/drawing/2017/model3d" xmlns:o="urn:schemas-microsoft-com:office:office" xmlns:oel="http://schemas.microsoft.com/office/2019/extlst" xmlns:r="http://schemas.openxmlformats.org/officeDocument/2006/relationships" xmlns:m="http://schemas.openxmlformats.org/officeDocument/2006/math" xmlns:v="urn:schemas-microsoft-com:vml" xmlns:wp14="http://schemas.microsoft.com/office/word/2010/wordprocessingDrawing" xmlns:wp="http://schemas.openxmlformats.org/drawingml/2006/wordprocessingDrawing" xmlns:w10="urn:schemas-microsoft-com:office:word" xmlns:w="http://schemas.openxmlformats.org/wordprocessingml/2006/main" xmlns:w14="http://schemas.microsoft.com/office/word/2010/wordml" xmlns:w15="http://schemas.microsoft.com/office/word/2012/wordml" xmlns:w16cex="http://schemas.microsoft.com/office/word/2018/wordml/cex" xmlns:w16cid="http://schemas.microsoft.com/office/word/2016/wordml/cid" xmlns:w16="http://schemas.microsoft.com/office/word/2018/wordml" xmlns:w16du="http://schemas.microsoft.com/office/word/2023/wordml/word16du" xmlns:w16sdtdh="http://schemas.microsoft.com/office/word/2020/wordml/sdtdatahash" xmlns:w16sdtfl="http://schemas.microsoft.com/office/word/2024/wordml/sdtformatlock" xmlns:w16se="http://schemas.microsoft.com/office/word/2015/wordml/symex" xmlns:wpg="http://schemas.microsoft.com/office/word/2010/wordprocessingGroup" xmlns:wpi="http://schemas.microsoft.com/office/word/2010/wordprocessingInk" xmlns:wne="http://schemas.microsoft.com/office/word/2006/wordml" xmlns:wps="http://schemas.microsoft.com/office/word/2010/wordprocessingShape" mc:Ignorable="w14 w15 w16se w16cid w16 w16cex w16sdtdh w16sdtfl w16du wp14">
   <w:body>
     <w:p>
+      <w:pPr>
+        <w:jc w:val="center"/>
+      </w:pPr>
       <w:r>
         <w:rPr>
           <w:b/>
@@ -12,61 +15,179 @@
       </w:r>
     </w:p>
     <w:p>
-      <w:r>
-        <w:rPr>
-          <w:b/>
-          <w:bCs/>
-        </w:rPr>
-        <w:t>by</w:t>
-      </w:r>
-    </w:p>
-    <w:p>
-      <w:r>
-        <w:rPr>
-          <w:b/>
-          <w:bCs/>
-        </w:rPr>
-        <w:t>[Your Name Surname] - [Student ID]</w:t>
-      </w:r>
-    </w:p>
-    <w:p>
-      <w:r>
-        <w:rPr>
-          <w:b/>
-          <w:bCs/>
-        </w:rPr>
-        <w:t>[Team Member's Name] - [Student ID]</w:t>
-      </w:r>
-    </w:p>
-    <w:p>
-      <w:r>
-        <w:rPr>
-          <w:b/>
-          <w:bCs/>
-        </w:rPr>
-        <w:t>[Team Member's Name] - [Student ID]</w:t>
-      </w:r>
-    </w:p>
-    <w:p>
-      <w:r>
-        <w:rPr>
-          <w:b/>
-          <w:bCs/>
+      <w:pPr>
+        <w:jc w:val="center"/>
+      </w:pPr>
+      <w:r>
+        <w:t>b</w:t>
+      </w:r>
+      <w:r>
+        <w:t>y</w:t>
+      </w:r>
+    </w:p>
+    <w:p>
+      <w:pPr>
+        <w:jc w:val="center"/>
+      </w:pPr>
+      <w:r>
+        <w:rPr>
+          <w:b/>
+          <w:bCs/>
+        </w:rPr>
+        <w:t>Ahmet Abdullah Gültekin</w:t>
+      </w:r>
+      <w:r>
+        <w:rPr>
+          <w:b/>
+          <w:bCs/>
+        </w:rPr>
+        <w:t xml:space="preserve"> - </w:t>
+      </w:r>
+      <w:r>
+        <w:rPr>
+          <w:b/>
+          <w:bCs/>
+        </w:rPr>
+        <w:t>150121025</w:t>
+      </w:r>
+    </w:p>
+    <w:p>
+      <w:pPr>
+        <w:jc w:val="center"/>
+      </w:pPr>
+      <w:r>
+        <w:rPr>
+          <w:b/>
+          <w:bCs/>
+        </w:rPr>
+        <w:t>Ayşe Gülsüm Eren</w:t>
+      </w:r>
+      <w:r>
+        <w:rPr>
+          <w:b/>
+          <w:bCs/>
+        </w:rPr>
+        <w:t xml:space="preserve"> - </w:t>
+      </w:r>
+      <w:r>
+        <w:rPr>
+          <w:b/>
+          <w:bCs/>
+        </w:rPr>
+        <w:t>150120005</w:t>
+      </w:r>
+    </w:p>
+    <w:p>
+      <w:pPr>
+        <w:jc w:val="center"/>
+        <w:rPr>
+          <w:b/>
+          <w:bCs/>
+        </w:rPr>
+      </w:pPr>
+      <w:r>
+        <w:rPr>
+          <w:b/>
+          <w:bCs/>
+        </w:rPr>
+        <w:t>Ayşenur Arıcı</w:t>
+      </w:r>
+      <w:r>
+        <w:rPr>
+          <w:b/>
+          <w:bCs/>
+        </w:rPr>
+        <w:t xml:space="preserve"> </w:t>
+      </w:r>
+      <w:r>
+        <w:rPr>
+          <w:b/>
+          <w:bCs/>
+        </w:rPr>
+        <w:t>–</w:t>
+      </w:r>
+      <w:r>
+        <w:rPr>
+          <w:b/>
+          <w:bCs/>
+        </w:rPr>
+        <w:t xml:space="preserve"> </w:t>
+      </w:r>
+      <w:r>
+        <w:rPr>
+          <w:b/>
+          <w:bCs/>
+        </w:rPr>
+        <w:t>150123825</w:t>
+      </w:r>
+    </w:p>
+    <w:p>
+      <w:pPr>
+        <w:jc w:val="center"/>
+        <w:rPr>
+          <w:sz w:val="32"/>
+          <w:szCs w:val="32"/>
+        </w:rPr>
+      </w:pPr>
+    </w:p>
+    <w:p>
+      <w:pPr>
+        <w:jc w:val="center"/>
+        <w:rPr>
+          <w:sz w:val="32"/>
+          <w:szCs w:val="32"/>
+        </w:rPr>
+      </w:pPr>
+      <w:r>
+        <w:rPr>
+          <w:b/>
+          <w:bCs/>
+          <w:sz w:val="32"/>
+          <w:szCs w:val="32"/>
         </w:rPr>
         <w:t>CSE4297 Engineering Project 1</w:t>
       </w:r>
       <w:r>
+        <w:rPr>
+          <w:sz w:val="32"/>
+          <w:szCs w:val="32"/>
+        </w:rPr>
         <w:t xml:space="preserve"> </w:t>
       </w:r>
-      <w:r>
-        <w:rPr>
-          <w:b/>
-          <w:bCs/>
+    </w:p>
+    <w:p>
+      <w:pPr>
+        <w:jc w:val="center"/>
+        <w:rPr>
+          <w:b/>
+          <w:bCs/>
+          <w:sz w:val="32"/>
+          <w:szCs w:val="32"/>
+        </w:rPr>
+      </w:pPr>
+      <w:r>
+        <w:rPr>
+          <w:b/>
+          <w:bCs/>
+          <w:sz w:val="32"/>
+          <w:szCs w:val="32"/>
         </w:rPr>
         <w:t>Project Specification Document</w:t>
       </w:r>
     </w:p>
     <w:p>
+      <w:pPr>
+        <w:jc w:val="center"/>
+        <w:rPr>
+          <w:sz w:val="32"/>
+          <w:szCs w:val="32"/>
+        </w:rPr>
+      </w:pPr>
+    </w:p>
+    <w:p>
+      <w:pPr>
+        <w:jc w:val="center"/>
+      </w:pPr>
       <w:r>
         <w:rPr>
           <w:b/>
@@ -76,15 +197,48 @@
       </w:r>
     </w:p>
     <w:p>
-      <w:r>
-        <w:rPr>
-          <w:b/>
-          <w:bCs/>
-        </w:rPr>
-        <w:t>[Supervisor's Title and Name]</w:t>
-      </w:r>
-    </w:p>
-    <w:p>
+      <w:pPr>
+        <w:jc w:val="center"/>
+        <w:rPr>
+          <w:b/>
+          <w:bCs/>
+        </w:rPr>
+      </w:pPr>
+      <w:r>
+        <w:rPr>
+          <w:b/>
+          <w:bCs/>
+        </w:rPr>
+        <w:t>Assoc. Prof. Mustafa Ağaoğlu</w:t>
+      </w:r>
+    </w:p>
+    <w:p>
+      <w:pPr>
+        <w:jc w:val="center"/>
+        <w:rPr>
+          <w:b/>
+          <w:bCs/>
+        </w:rPr>
+      </w:pPr>
+    </w:p>
+    <w:p>
+      <w:pPr>
+        <w:jc w:val="center"/>
+        <w:rPr>
+          <w:b/>
+          <w:bCs/>
+        </w:rPr>
+      </w:pPr>
+    </w:p>
+    <w:p>
+      <w:pPr>
+        <w:jc w:val="center"/>
+      </w:pPr>
+    </w:p>
+    <w:p>
+      <w:pPr>
+        <w:jc w:val="center"/>
+      </w:pPr>
       <w:r>
         <w:rPr>
           <w:b/>
@@ -94,6 +248,9 @@
       </w:r>
     </w:p>
     <w:p>
+      <w:pPr>
+        <w:jc w:val="center"/>
+      </w:pPr>
       <w:r>
         <w:rPr>
           <w:b/>
@@ -103,31 +260,99 @@
       </w:r>
     </w:p>
     <w:p>
-      <w:r>
-        <w:rPr>
-          <w:b/>
-          <w:bCs/>
-        </w:rPr>
-        <w:t>October 18, 2025</w:t>
-      </w:r>
-    </w:p>
-    <w:p>
-      <w:r>
-        <w:t>Copyright © [Your Name], [Team Member's Name], [Team Member's Name], 2025. All rights reserved.</w:t>
-      </w:r>
-    </w:p>
-    <w:p>
-      <w:pPr>
-        <w:rPr>
-          <w:b/>
-          <w:bCs/>
-        </w:rPr>
-      </w:pPr>
-      <w:r>
-        <w:rPr>
-          <w:b/>
-          <w:bCs/>
-        </w:rPr>
+      <w:pPr>
+        <w:jc w:val="center"/>
+      </w:pPr>
+      <w:r>
+        <w:rPr>
+          <w:b/>
+          <w:bCs/>
+        </w:rPr>
+        <w:t>05.11.</w:t>
+      </w:r>
+      <w:r>
+        <w:rPr>
+          <w:b/>
+          <w:bCs/>
+        </w:rPr>
+        <w:t>2025</w:t>
+      </w:r>
+    </w:p>
+    <w:p>
+      <w:pPr>
+        <w:jc w:val="center"/>
+      </w:pPr>
+    </w:p>
+    <w:p>
+      <w:pPr>
+        <w:jc w:val="center"/>
+      </w:pPr>
+    </w:p>
+    <w:p>
+      <w:pPr>
+        <w:jc w:val="center"/>
+      </w:pPr>
+    </w:p>
+    <w:p>
+      <w:pPr>
+        <w:jc w:val="center"/>
+      </w:pPr>
+    </w:p>
+    <w:p>
+      <w:pPr>
+        <w:jc w:val="center"/>
+      </w:pPr>
+    </w:p>
+    <w:p>
+      <w:pPr>
+        <w:jc w:val="center"/>
+      </w:pPr>
+    </w:p>
+    <w:p>
+      <w:pPr>
+        <w:jc w:val="center"/>
+      </w:pPr>
+    </w:p>
+    <w:p>
+      <w:pPr>
+        <w:jc w:val="center"/>
+      </w:pPr>
+    </w:p>
+    <w:p>
+      <w:pPr>
+        <w:jc w:val="center"/>
+      </w:pPr>
+      <w:r>
+        <w:t xml:space="preserve">Copyright © </w:t>
+      </w:r>
+      <w:r>
+        <w:t>Group members listed above</w:t>
+      </w:r>
+      <w:r>
+        <w:t>, 2025. All rights reserved.</w:t>
+      </w:r>
+    </w:p>
+    <w:p>
+      <w:pPr>
+        <w:rPr>
+          <w:b/>
+          <w:bCs/>
+        </w:rPr>
+      </w:pPr>
+    </w:p>
+    <w:p>
+      <w:pPr>
+        <w:rPr>
+          <w:b/>
+          <w:bCs/>
+        </w:rPr>
+      </w:pPr>
+      <w:r>
+        <w:rPr>
+          <w:b/>
+          <w:bCs/>
+        </w:rPr>
+        <w:lastRenderedPageBreak/>
         <w:t>1. PROBLEM STATEMENT</w:t>
       </w:r>
     </w:p>
@@ -173,17 +398,29 @@
     </w:p>
     <w:p>
       <w:r>
-        <w:t xml:space="preserve">The primary motivation for this project is to create a secure, flexible, and user-friendly platform that consolidates these fragmented and insecure authentication methods. We plan to develop a cloud-native Software as a Service (SaaS) platform targeting B2B (Business-to-Business) and B2B2C (Business-to-Business-to-Consumer) markets. The </w:t>
+        <w:t>Cu</w:t>
+      </w:r>
+      <w:r>
+        <w:t>rrent biometric systems lack the sophisticated liveness detection capabilities necessary to combat increasingly sophisticated spoofing attempts. The absence of multi-modal biometric fusion leaves these systems vulnerable to presentation attacks, while their centralized data storage architectures present attractive targets for cyber criminals. The integration challenges between physical access control systems and digital authentication platforms result in fragmented security ecosystems that are difficult to manage and monitor comprehensively.</w:t>
+      </w:r>
+    </w:p>
+    <w:p>
+      <w:r>
+        <w:t>From a distributed systems perspective, traditional authentication services face significant performance bottlenecks when processing high volumes of concurrent verification requests. The lack of proper caching strategies, absence of load balancing mechanisms, and inefficient database query patterns lead to increased latency and degraded user experience</w:t>
+      </w:r>
+    </w:p>
+    <w:p>
+      <w:r>
+        <w:t>Legacy authentication systems violate fundamental software engineering principles, making them difficult to maintain and extend. The violation of the Single Responsibility Principle results in authentication services that handle everything from user management to audit logging, creating unwieldy codebases. The lack of proper abstraction layers and dependency inversion makes it nearly impossible to swap out components or integrate new biometric modalities without extensive refactoring. These systems often lack comprehensive API documentation, making third-party integration challenging and error-prone.</w:t>
+      </w:r>
+    </w:p>
+    <w:p>
+      <w:r>
+        <w:t xml:space="preserve">The primary motivation for this project is to create a secure, flexible, and user-friendly platform that consolidates these fragmented and insecure authentication methods. We </w:t>
       </w:r>
       <w:r>
         <w:lastRenderedPageBreak/>
-        <w:t>project aims to unify both physical (e.g., opening doors) and digital (e.g., logging into systems) access control for a wide range of applications, from residential complexes to corporate offices</w:t>
-      </w:r>
-      <w:r>
-        <w:t>. The</w:t>
-      </w:r>
-      <w:r>
-        <w:t xml:space="preserve"> platform is intended to differentiate itself and fill a significant market gap through its unique liveness detection mechanism against fraud and its high accuracy achieved by fusing multiple biometric modalities. </w:t>
+        <w:t xml:space="preserve">plan to develop a cloud-native Software as a Service (SaaS) platform targeting B2B (Business-to-Business) and B2B2C (Business-to-Business-to-Consumer) markets. The project aims to unify both physical (e.g., opening doors) and digital (e.g., logging into systems) access control for a wide range of applications, from residential complexes to corporate offices. The platform is intended to differentiate itself and fill a significant market gap through its unique liveness detection mechanism against fraud and its high accuracy achieved by fusing multiple biometric modalities. </w:t>
       </w:r>
     </w:p>
     <w:p>
@@ -212,7 +449,7 @@
         <w:t xml:space="preserve"> design, develop, and present a prototype of </w:t>
       </w:r>
       <w:r>
-        <w:t xml:space="preserve">a multi-tenant, cloud-native, multi-platform system that supports web, mobile, and desktop clients, providing a multi-biometric identity authentication SaaS platform </w:t>
+        <w:t xml:space="preserve">a multi-tenant, cloud-native, multi-platform system providing a multi-biometric identity authentication SaaS platform </w:t>
       </w:r>
       <w:r>
         <w:t>that serves as a modern, secure, and flexible alternative to traditional authentication systems.</w:t>
@@ -301,8 +538,6 @@
         <w:t xml:space="preserve"> across educational, enterprise, and governmental domains.</w:t>
       </w:r>
     </w:p>
-    <w:p/>
-    <w:p/>
     <w:p>
       <w:pPr>
         <w:rPr>
@@ -363,7 +598,52 @@
         <w:t>​</w:t>
       </w:r>
       <w:r>
-        <w:t>Our main innovation is in how we apply this model. We address the challenge of creating a trusted "ground truth" embedding by extracting the face directly from an official ID document during enrollment. This provides a much higher level of trust than systems that just rely on a user's selfie. But a good model isn't enough, as it remains vulnerable to spoofing. To address this, our system integrates a dedicated liveness detection module. We use Google's MediaPipe framework for real-time landmark tracking to confirm the user is a live person by detecting actions like blinking, which is crucial for preventing attacks that use a simple photo.</w:t>
+        <w:t>Our main innovation is in how we apply this model. We address the challenge of creating a trusted "ground truth" embedding by extracting the face directly from an official ID document during enrollment. This provides a much higher level of trust than systems that just rely on a user's selfie. But a good model isn't enough, as it remains vulnerable to spoofing.</w:t>
+      </w:r>
+      <w:r>
+        <w:t xml:space="preserve"> </w:t>
+      </w:r>
+      <w:r>
+        <w:t>Despite advances in recognition accuracy, facial recognition systems remain vulnerable to presentation attacks, where adversaries attempt to deceive the system using printed photographs, video replays, 3D masks, or increasingly sophisticated deepfake technology. Contemporary research has established that effective anti-spoofing requires multi-modal analysis combining texture, motion, and depth cues. ResNet-18 architectures trained with specialized loss functions</w:t>
+      </w:r>
+      <w:r>
+        <w:t xml:space="preserve">, </w:t>
+      </w:r>
+      <w:r>
+        <w:t>particularly Similarity Loss and AdMSoftmax Loss</w:t>
+      </w:r>
+      <w:r>
+        <w:t xml:space="preserve">, </w:t>
+      </w:r>
+      <w:r>
+        <w:t>have demonstrated superior performance in distinguishing live faces from various spoofing attempts. These models analyze subtle texture patterns, reflectance properties, and micro-movements that differentiate genuine faces from artificial reproductions.</w:t>
+      </w:r>
+    </w:p>
+    <w:p>
+      <w:r>
+        <w:t xml:space="preserve">To address this, our system integrates a dedicated liveness detection module that combines both passive and active approaches. Liveness detection strategies can be categorized into passive and active approaches. Passive methods analyze single images or short video sequences for inherent artifacts of spoofing attacks, such as moiré </w:t>
+      </w:r>
+      <w:r>
+        <w:lastRenderedPageBreak/>
+        <w:t>patterns in printed photos, unnatural reflections, or absence of physiological micro-movements. Active methods require user cooperation, typically prompting specific actions such as blinking, head rotation, or facial expressions</w:t>
+      </w:r>
+      <w:r>
+        <w:t>. We use Google's Medi</w:t>
+      </w:r>
+      <w:r>
+        <w:t>active</w:t>
+      </w:r>
+      <w:r>
+        <w:t>aPipe framework for real-time landmark tracking to confirm the user is a live person by detecting actions like blinking, which is crucial for preventing attacks that use a simple photo.</w:t>
+      </w:r>
+      <w:r>
+        <w:t xml:space="preserve"> </w:t>
+      </w:r>
+      <w:r>
+        <w:t>MediaPipe Face Detection has emerged as a particularly effective framework for real-time landmark tracking, enabling robust active liveness verification by monitoring compliance with challenge-response protocols. In our implementation, we deploy a Python-based anti-spoofing microservice that processes live video streams through a ResNet-18 model trained with AdMSoftmax Loss, achieving real-time detection of presentation attacks with sub-100ms latency. This service integrates seamlessly with our MediaPipe-based liveness detection pipeline, providing a two-layer defense: passive texture analysis for immediate artifact detection, followed by active challenge-response verification requiring user interaction.</w:t>
+      </w:r>
+      <w:r>
+        <w:t xml:space="preserve"> </w:t>
       </w:r>
     </w:p>
     <w:p>
@@ -374,7 +654,15 @@
         <w:t>​</w:t>
       </w:r>
       <w:r>
-        <w:t>Finally, our project's primary contribution is its complete architecture. While many studies focus only on the AI model's accuracy, we focused on the engineering challenge of building a scalable and secure cloud-based system. We adopted a microservices architecture to separate our core Java-based business logic from the heavy Python-based biometric processing. This design, combined with a high-speed FAISS vector database for 1:N identification and a Redis cache for system communication, bridges the critical gap between a theoretical model and a production-ready identity verification system.</w:t>
+        <w:t xml:space="preserve">Finally, our project's primary contribution is its complete architecture. While many studies focus only on the AI model's accuracy, we focused on the engineering challenge of building a scalable and secure cloud-based system. </w:t>
+      </w:r>
+      <w:r>
+        <w:t>Modern facial recognition systems increasingly adopt microservices architecture to achieve scalability, maintainability, and deployment flexibility. The microservices pattern decomposes monolithic applications into loosely coupled services, each implementing a specific business capability and communicating through well-defined APIs. This architectural style offers several advantages for biometric systems: independent scaling of compute-intensive components (face detection, feature extraction, inference) separate from lightweight operations (user management, audit logging); technology heterogeneity enabling optimal language and framework selection per service; fault isolation ensuring that failures in one component don't cascade through the system; and simplified continuous deployment through independent service versioning.</w:t>
+      </w:r>
+    </w:p>
+    <w:p>
+      <w:r>
+        <w:t>We adopted a microservices architecture to separate our core Java-based business logic from the heavy Python-based biometric processing. This design, combined with a high-speed FAISS vector database for 1:N identification and a Redis cache for system communication, bridges the critical gap between a theoretical model and a production-ready identity verification system.</w:t>
       </w:r>
     </w:p>
     <w:p>
@@ -394,7 +682,6 @@
     </w:p>
     <w:p>
       <w:r>
-        <w:lastRenderedPageBreak/>
         <w:t>The scope of this project includes the development of a Minimum Viable Product (MVP) of the platform, encompassing its core functionalities. The items that are within and outside the scope of this project are clearly defined below.</w:t>
       </w:r>
     </w:p>
@@ -425,6 +712,7 @@
           <w:b/>
           <w:bCs/>
         </w:rPr>
+        <w:lastRenderedPageBreak/>
         <w:t>Backend Development:</w:t>
       </w:r>
       <w:r>
@@ -635,7 +923,6 @@
           <w:b/>
           <w:bCs/>
         </w:rPr>
-        <w:lastRenderedPageBreak/>
         <w:t>Technology Constraints:</w:t>
       </w:r>
       <w:r>
@@ -672,6 +959,7 @@
           <w:b/>
           <w:bCs/>
         </w:rPr>
+        <w:lastRenderedPageBreak/>
         <w:t>Data Constraints:</w:t>
       </w:r>
       <w:r>
@@ -812,42 +1100,42 @@
     </w:p>
     <w:p>
       <w:r>
+        <w:t xml:space="preserve">The backend is composed of two main microservices developed with Hexagonal Architecture principles. The </w:t>
+      </w:r>
+      <w:r>
+        <w:rPr>
+          <w:b/>
+          <w:bCs/>
+        </w:rPr>
+        <w:t>Identity Core API (Spring Boot)</w:t>
+      </w:r>
+      <w:r>
+        <w:t xml:space="preserve">, acting as the system's brain, manages user, role, and tenant administration, security policies, and business workflows, using Spring Data JPA for data persistence. The </w:t>
+      </w:r>
+      <w:r>
+        <w:rPr>
+          <w:b/>
+          <w:bCs/>
+        </w:rPr>
+        <w:t>Biometric Processor API (FastAPI)</w:t>
+      </w:r>
+      <w:r>
+        <w:t xml:space="preserve"> leverages Python's powerful machine learning ecosystem to handle computationally intensive tasks like face recognition and liveness detection. Communication between the two services will be handled via REST API calls (synchronous) and a Redis-based message queue (asynchronous).</w:t>
+      </w:r>
+    </w:p>
+    <w:p>
+      <w:pPr>
+        <w:rPr>
+          <w:b/>
+          <w:bCs/>
+        </w:rPr>
+      </w:pPr>
+      <w:r>
+        <w:rPr>
+          <w:b/>
+          <w:bCs/>
+        </w:rPr>
         <w:lastRenderedPageBreak/>
-        <w:t xml:space="preserve">The backend is composed of two main microservices developed with Hexagonal Architecture principles. The </w:t>
-      </w:r>
-      <w:r>
-        <w:rPr>
-          <w:b/>
-          <w:bCs/>
-        </w:rPr>
-        <w:t>Identity Core API (Spring Boot)</w:t>
-      </w:r>
-      <w:r>
-        <w:t xml:space="preserve">, acting as the system's brain, manages user, role, and tenant administration, security policies, and business workflows, using Spring Data JPA for data persistence. The </w:t>
-      </w:r>
-      <w:r>
-        <w:rPr>
-          <w:b/>
-          <w:bCs/>
-        </w:rPr>
-        <w:t>Biometric Processor API (FastAPI)</w:t>
-      </w:r>
-      <w:r>
-        <w:t xml:space="preserve"> leverages Python's powerful machine learning ecosystem to handle computationally intensive tasks like face recognition and liveness detection. Communication between the two services will be handled via REST API calls (synchronous) and a Redis-based message queue (asynchronous).</w:t>
-      </w:r>
-    </w:p>
-    <w:p>
-      <w:pPr>
-        <w:rPr>
-          <w:b/>
-          <w:bCs/>
-        </w:rPr>
-      </w:pPr>
-      <w:r>
-        <w:rPr>
-          <w:b/>
-          <w:bCs/>
-        </w:rPr>
         <w:t>6.2.2. Biometric Puzzle (Liveness Detection) Algorithm</w:t>
       </w:r>
     </w:p>
@@ -959,11 +1247,7 @@
     </w:p>
     <w:p>
       <w:r>
-        <w:t xml:space="preserve">The system's performance will be evaluated based on both biometric accuracy and system response times. The accuracy of the biometric model will be measured using </w:t>
-      </w:r>
-      <w:r>
-        <w:lastRenderedPageBreak/>
-        <w:t>standard metrics: False Acceptance Rate (FAR) and False Rejection Rate (FRR). The success of the liveness detection algorithm will be assessed by its resilience against known spoofing attempts (e.g., printed photos, video replays) and its completion time for legitimate users. API response times and database query latencies will be measured through load testing to ensure they meet the target performance criteria.</w:t>
+        <w:t>The system's performance will be evaluated based on both biometric accuracy and system response times. The accuracy of the biometric model will be measured using standard metrics: False Acceptance Rate (FAR) and False Rejection Rate (FRR). The success of the liveness detection algorithm will be assessed by its resilience against known spoofing attempts (e.g., printed photos, video replays) and its completion time for legitimate users. API response times and database query latencies will be measured through load testing to ensure they meet the target performance criteria.</w:t>
       </w:r>
     </w:p>
     <w:p>
@@ -1011,6 +1295,7 @@
           <w:b/>
           <w:bCs/>
         </w:rPr>
+        <w:lastRenderedPageBreak/>
         <w:t>Libraries/Frameworks:</w:t>
       </w:r>
       <w:r>
@@ -1191,11 +1476,7 @@
         <w:t>Environmental:</w:t>
       </w:r>
       <w:r>
-        <w:t xml:space="preserve"> The project is a software product and does not produce direct environmental waste. However, the energy consumption of the servers and </w:t>
-      </w:r>
-      <w:r>
-        <w:lastRenderedPageBreak/>
-        <w:t>mobile devices it runs on constitutes an indirect environmental impact. The architecture is designed to operate efficiently to minimize this impact.</w:t>
+        <w:t xml:space="preserve"> The project is a software product and does not produce direct environmental waste. However, the energy consumption of the servers and mobile devices it runs on constitutes an indirect environmental impact. The architecture is designed to operate efficiently to minimize this impact.</w:t>
       </w:r>
     </w:p>
     <w:p>
@@ -1228,6 +1509,7 @@
           <w:b/>
           <w:bCs/>
         </w:rPr>
+        <w:lastRenderedPageBreak/>
         <w:t>Health and Safety:</w:t>
       </w:r>
       <w:r>
@@ -1357,7 +1639,6 @@
           <w:b/>
           <w:bCs/>
         </w:rPr>
-        <w:lastRenderedPageBreak/>
         <w:t>[Your Name Surname] (Project Lead &amp; Backend Developer):</w:t>
       </w:r>
       <w:r>
@@ -1394,6 +1675,7 @@
           <w:b/>
           <w:bCs/>
         </w:rPr>
+        <w:lastRenderedPageBreak/>
         <w:t>[Team Member's Name] (AI/ML &amp; Biometric Systems):</w:t>
       </w:r>
       <w:r>
@@ -1593,7 +1875,6 @@
           <w:b/>
           <w:bCs/>
         </w:rPr>
-        <w:lastRenderedPageBreak/>
         <w:t>Objective 5: To design the multi-tenant data model.</w:t>
       </w:r>
       <w:r>
@@ -1642,6 +1923,7 @@
           <w:b/>
           <w:bCs/>
         </w:rPr>
+        <w:lastRenderedPageBreak/>
         <w:t>Risk 1: Insufficient Technical Competency</w:t>
       </w:r>
       <w:r>
@@ -1796,31 +2078,31 @@
     </w:p>
     <w:p>
       <w:r>
-        <w:t xml:space="preserve">The "Biometric Puzzle" algorithm to be developed within this project presents an innovative approach to active liveness detection. The results of the analysis on the algorithm's performance, accuracy, and resilience against spoofing attacks have the potential to contribute to the literature in this field. If successful results are obtained, </w:t>
+        <w:t>The "Biometric Puzzle" algorithm to be developed within this project presents an innovative approach to active liveness detection. The results of the analysis on the algorithm's performance, accuracy, and resilience against spoofing attacks have the potential to contribute to the literature in this field. If successful results are obtained, the project outcomes are targeted for presentation at a national or international conference or for publication as a scientific paper.</w:t>
+      </w:r>
+    </w:p>
+    <w:p>
+      <w:pPr>
+        <w:rPr>
+          <w:b/>
+          <w:bCs/>
+        </w:rPr>
+      </w:pPr>
+      <w:r>
+        <w:rPr>
+          <w:b/>
+          <w:bCs/>
+        </w:rPr>
+        <w:t>10.3. Economic/Commercial/Social Impact</w:t>
+      </w:r>
+    </w:p>
+    <w:p>
+      <w:r>
+        <w:t xml:space="preserve">This project will produce a prototype with high potential for direct commercialization. The developed SaaS platform can be introduced to the market with a subscription-based revenue model and could form the basis of a start-up company. There is a notable gap in the Turkish market for a domestic, KVKK-compliant, modern biometric solution that unifies both physical and digital access; Bigenity has the potential to fill this gap. </w:t>
       </w:r>
       <w:r>
         <w:lastRenderedPageBreak/>
-        <w:t>the project outcomes are targeted for presentation at a national or international conference or for publication as a scientific paper.</w:t>
-      </w:r>
-    </w:p>
-    <w:p>
-      <w:pPr>
-        <w:rPr>
-          <w:b/>
-          <w:bCs/>
-        </w:rPr>
-      </w:pPr>
-      <w:r>
-        <w:rPr>
-          <w:b/>
-          <w:bCs/>
-        </w:rPr>
-        <w:t>10.3. Economic/Commercial/Social Impact</w:t>
-      </w:r>
-    </w:p>
-    <w:p>
-      <w:r>
-        <w:t>This project will produce a prototype with high potential for direct commercialization. The developed SaaS platform can be introduced to the market with a subscription-based revenue model and could form the basis of a start-up company. There is a notable gap in the Turkish market for a domestic, KVKK-compliant, modern biometric solution that unifies both physical and digital access; Bigenity has the potential to fill this gap. Socially, secure and easily accessible authentication systems will accelerate digital transformation and reduce cybercrime, thereby improving the overall quality of life.</w:t>
+        <w:t>Socially, secure and easily accessible authentication systems will accelerate digital transformation and reduce cybercrime, thereby improving the overall quality of life.</w:t>
       </w:r>
     </w:p>
     <w:p>
@@ -1970,31 +2252,31 @@
     </w:p>
     <w:p>
       <w:r>
-        <w:t xml:space="preserve">The development cost of the project is close to zero as it exclusively uses free and open-source software. In a potential commercialization scenario, the main cost items would </w:t>
+        <w:t>The development cost of the project is close to zero as it exclusively uses free and open-source software. In a potential commercialization scenario, the main cost items would be server hosting (cloud), external API costs (e.g., for sending SMS), and personnel expenses. A review of the per-user monthly pricing models of competitor products (e.g., Okta, Auth0) indicates that Bigenity has the potential to enter the market with more competitive pricing.</w:t>
+      </w:r>
+    </w:p>
+    <w:p>
+      <w:pPr>
+        <w:rPr>
+          <w:b/>
+          <w:bCs/>
+        </w:rPr>
+      </w:pPr>
+      <w:r>
+        <w:rPr>
+          <w:b/>
+          <w:bCs/>
+        </w:rPr>
+        <w:t>Environmental</w:t>
+      </w:r>
+    </w:p>
+    <w:p>
+      <w:r>
+        <w:t xml:space="preserve">The project is a software product by nature and does not generate direct environmental waste. Its indirect impact is the energy consumption of the servers and end-user devices it runs on. The microservices architecture is designed to scale resources </w:t>
       </w:r>
       <w:r>
         <w:lastRenderedPageBreak/>
-        <w:t>be server hosting (cloud), external API costs (e.g., for sending SMS), and personnel expenses. A review of the per-user monthly pricing models of competitor products (e.g., Okta, Auth0) indicates that Bigenity has the potential to enter the market with more competitive pricing.</w:t>
-      </w:r>
-    </w:p>
-    <w:p>
-      <w:pPr>
-        <w:rPr>
-          <w:b/>
-          <w:bCs/>
-        </w:rPr>
-      </w:pPr>
-      <w:r>
-        <w:rPr>
-          <w:b/>
-          <w:bCs/>
-        </w:rPr>
-        <w:t>Environmental</w:t>
-      </w:r>
-    </w:p>
-    <w:p>
-      <w:r>
-        <w:t>The project is a software product by nature and does not generate direct environmental waste. Its indirect impact is the energy consumption of the servers and end-user devices it runs on. The microservices architecture is designed to scale resources according to need, thereby preventing unnecessary energy consumption. By eliminating the need for physical cards or keys, it could have an indirect effect of reducing plastic and metal waste.</w:t>
+        <w:t>according to need, thereby preventing unnecessary energy consumption. By eliminating the need for physical cards or keys, it could have an indirect effect of reducing plastic and metal waste.</w:t>
       </w:r>
     </w:p>
     <w:p>
@@ -2126,31 +2408,31 @@
     </w:p>
     <w:p>
       <w:r>
-        <w:t xml:space="preserve">The sustainability of the project is built on its modular and flexible architecture. The microservices approach allows for the future addition of new biometric modalities </w:t>
+        <w:t>The sustainability of the project is built on its modular and flexible architecture. The microservices approach allows for the future addition of new biometric modalities (voice, fingerprint) or new features without disrupting the rest of the system. The use of Docker ensures that the system can be easily migrated between different cloud platforms or servers. This technological flexibility aims to ensure the project's longevity by allowing it to adapt to changing needs over many years.</w:t>
+      </w:r>
+    </w:p>
+    <w:p>
+      <w:pPr>
+        <w:rPr>
+          <w:b/>
+          <w:bCs/>
+        </w:rPr>
+      </w:pPr>
+      <w:r>
+        <w:rPr>
+          <w:b/>
+          <w:bCs/>
+        </w:rPr>
+        <w:t>Social</w:t>
+      </w:r>
+    </w:p>
+    <w:p>
+      <w:r>
+        <w:t xml:space="preserve">Bigenity has the potential to make a positive social contribution by increasing digital literacy and security. By offering a secure digital experience with biometric features that everyone possesses, instead of complex and insecure methods like passwords, it can </w:t>
       </w:r>
       <w:r>
         <w:lastRenderedPageBreak/>
-        <w:t>(voice, fingerprint) or new features without disrupting the rest of the system. The use of Docker ensures that the system can be easily migrated between different cloud platforms or servers. This technological flexibility aims to ensure the project's longevity by allowing it to adapt to changing needs over many years.</w:t>
-      </w:r>
-    </w:p>
-    <w:p>
-      <w:pPr>
-        <w:rPr>
-          <w:b/>
-          <w:bCs/>
-        </w:rPr>
-      </w:pPr>
-      <w:r>
-        <w:rPr>
-          <w:b/>
-          <w:bCs/>
-        </w:rPr>
-        <w:t>Social</w:t>
-      </w:r>
-    </w:p>
-    <w:p>
-      <w:r>
-        <w:t>Bigenity has the potential to make a positive social contribution by increasing digital literacy and security. By offering a secure digital experience with biometric features that everyone possesses, instead of complex and insecure methods like passwords, it can promote equality in access to technology. However, ensuring the project does not exclude certain groups (e.g., providing alternative authentication methods for people with facial scars or those who have difficulty making certain expressions) is important for social inclusion and will be considered in future versions.</w:t>
+        <w:t>promote equality in access to technology. However, ensuring the project does not exclude certain groups (e.g., providing alternative authentication methods for people with facial scars or those who have difficulty making certain expressions) is important for social inclusion and will be considered in future versions.</w:t>
       </w:r>
     </w:p>
     <w:sectPr>

</xml_diff>